<commit_message>
Corduba: correct the census locus to lib. I q. XVII s. 2 (Sapiens fidem) and distinguish him from 1b-iv
Co-Authored-By: Claude Fable 5 <noreply@anthropic.com>
Claude-Session: https://claude.ai/code/session_01QEPso8ntskGCmG2j9vjV5r
</commit_message>
<xml_diff>
--- a/1569 Corduba/1569_Corduba_EN_WORD.docx
+++ b/1569 Corduba/1569_Corduba_EN_WORD.docx
@@ -442,13 +442,13 @@
       </w:r>
     </w:p>
     <w:bookmarkEnd w:id="27"/>
-    <w:bookmarkStart w:id="28" w:name="X0c97de11c7287c90030e7ba8b5b9a4b08842698"/>
+    <w:bookmarkStart w:id="28" w:name="X336c4117b0565c9f6c0f057149b6e42f7e7c758"/>
     <w:p>
       <w:pPr>
         <w:pStyle w:val="Heading2"/>
       </w:pPr>
       <w:r>
-        <w:t xml:space="preserve">I. Liber I, Q. 17: the Immaculate Conception approbation (fol. 353)</w:t>
+        <w:t xml:space="preserve">I. Book I, Question XVII, § 2 — Savoring of faith: the census locus (printed p. 151)</w:t>
       </w:r>
     </w:p>
     <w:p>
@@ -456,44 +456,177 @@
         <w:pStyle w:val="FirstParagraph"/>
       </w:pPr>
       <w:r>
-        <w:t xml:space="preserve">{marg.</w:t>
-      </w:r>
-      <w:r>
-        <w:t xml:space="preserve"> </w:t>
-      </w:r>
+        <w:t xml:space="preserve">{p. 151}</w:t>
+      </w:r>
+    </w:p>
+    <w:p>
+      <w:pPr>
+        <w:pStyle w:val="BodyText"/>
+      </w:pPr>
       <w:r>
         <w:rPr>
           <w:iCs/>
           <w:i/>
         </w:rPr>
-        <w:t xml:space="preserve">Argument.</w:t>
-      </w:r>
-      <w:r>
-        <w:t xml:space="preserve"> </w:t>
-      </w:r>
-      <w:r>
-        <w:t xml:space="preserve">(badly inked)} If against the aforesaid it be argued that the rule of the nuns of the conception, made by Julius the second, is confirmed by him and by the church, as appears more at length below in the 6th conclusion, in the second and third proof. But this approbation seems to have the force of a determination of the church, where it is often said that the blessed virgin was conceived without original stain: therefore to hold the opposite is heretical, or a mortal sin.</w:t>
-      </w:r>
-    </w:p>
-    <w:p>
-      <w:pPr>
-        <w:pStyle w:val="BodyText"/>
-      </w:pPr>
-      <w:r>
-        <w:t xml:space="preserve">{marg.</w:t>
-      </w:r>
-      <w:r>
-        <w:t xml:space="preserve"> </w:t>
-      </w:r>
+        <w:t xml:space="preserve">[Closing paragraph of § 1, left column — the authorities for the whole doctrine, included as context for § 2.]</w:t>
+      </w:r>
+    </w:p>
+    <w:p>
+      <w:pPr>
+        <w:pStyle w:val="BodyText"/>
+      </w:pPr>
+      <w:r>
+        <w:t xml:space="preserve">Of all the aforesaid things Turrecremata treats particularly in summa de ecclesia lib. 4. par. 2. c. 8. &amp; 9. And Gerson Alphab. 14. e. f. l. And Ocham lib. 1. &amp; 2. dialogorum. And Gab. in 4. dist. 13. q. 2. And the book called Axiomata Christiana lib. 2. and especially art. 6. c. 11. And finally Castro de punitione hæreticorum lib. 1. c. 3. 4. &amp; 8. &amp; 9. &amp; 10. treats of it lucidly. And Symancas de hæreticis. c. 25. 26. &amp; 47.</w:t>
+      </w:r>
+    </w:p>
+    <w:p>
+      <w:r>
+        <w:pict>
+          <v:rect style="width:0;height:1.5pt" o:hralign="center" o:hrstd="t" o:hr="t"/>
+        </w:pict>
+      </w:r>
+    </w:p>
+    <w:p>
+      <w:pPr>
+        <w:pStyle w:val="FirstParagraph"/>
+      </w:pPr>
       <w:r>
         <w:rPr>
           <w:iCs/>
           <w:i/>
         </w:rPr>
-        <w:t xml:space="preserve">Response.</w:t>
-      </w:r>
-      <w:r>
-        <w:t xml:space="preserve">} I respond by denying the consequence, because that approbation of the rule, and determination of the church, is not of precept, nor is it a judicial definition, or obliging to hold it as of faith: but is of counsel, proposing or establishing it as of the piety of faith, and not as regards all the faithful, but as regards those only who, in honor of the immaculate conception piously believed, shall have wished to dedicate themselves to the observance of that religion, living according to that rule. Therefore only the pious belief, the cult, and the religion ordained for the fostering of this piety are confirmed and approved, without prejudice to the others who have not this piety. And when the Pope in the said rule often speaks of the immaculate conception of the blessed Virgin, he assuredly says this according to his own pious belief, and that of the church, and of the others willing to accept it, and not otherwise: just as also according to such piety he has established that the office of the immaculate conception is to be recited. For many things of this kind are established only of piety, and are read in the divine office and in the lections of the saints.</w:t>
+        <w:t xml:space="preserve">[§ 2 begins]</w:t>
+      </w:r>
+    </w:p>
+    <w:p>
+      <w:pPr>
+        <w:pStyle w:val="BodyText"/>
+      </w:pPr>
+      <w:r>
+        <w:t xml:space="preserve">{marg.</w:t>
+      </w:r>
+      <w:r>
+        <w:t xml:space="preserve"> </w:t>
+      </w:r>
+      <w:r>
+        <w:rPr>
+          <w:iCs/>
+          <w:i/>
+        </w:rPr>
+        <w:t xml:space="preserve">§. 2. Savoring of faith.</w:t>
+      </w:r>
+      <w:r>
+        <w:t xml:space="preserve">} A proposition savoring of faith is spoken of in two ways. First, as Cano says, vbi supra, and many others, when indeed it is not openly of faith, or a Catholic truth in some one of the modes aforesaid in the 1. §. preceding: but according to the common sense and opinion of the doctors it is reckoned to be of faith, or to pertain to it, as was just now said concerning the assumption of the Blessed Virgin at the end of the aforesaid §. 1.</w:t>
+      </w:r>
+    </w:p>
+    <w:p>
+      <w:pPr>
+        <w:pStyle w:val="BodyText"/>
+      </w:pPr>
+      <w:r>
+        <w:t xml:space="preserve">In the second way, according to Gerson, and Gabr. and Simancas, vbi sup. and Medina, where he is cited below, and the doctors commonly — and it seems the better definition — that proposition savors of faith which can be inferred, in a good and necessary consequence, from one [proposition] of faith together with another which, although it is not of faith, nevertheless cannot reasonably be denied. Or from which, together with another which cannot reasonably be denied, one [proposition] of faith can be inferred in a necessary consequence. Or which, in a probable enthymematic consequence which cannot reasonably be denied, follows from one or several [propositions] of faith: or from which, or from which several, in the same consequence one [proposition] of faith is inferred.</w:t>
+      </w:r>
+    </w:p>
+    <w:p>
+      <w:pPr>
+        <w:pStyle w:val="BodyText"/>
+      </w:pPr>
+      <w:r>
+        <w:t xml:space="preserve">An example of the first: this proposition — in the host of the altar is Christ, or, the Host of the altar which is elevated by the celebrating Priest is to be adored — savors of faith. For if it were said that in a Host duly consecrated Christ is, or that it is to be adored, that assuredly is of faith. But to say only that in the Host which is elevated by the Priest Christ is, or that it is to be adored, savors of faith. For it rightly follows in Barbara, or in darij: in every Host duly consecrated Christ is, and it is to be adored; but the Host of the altar, or that which is elevated by the celebrating Priest, is duly consecrated; therefore in it Christ is, and it is to be adored. Behold how, in a necessary consequence, from a major of faith, and from a minor which cannot reasonably, without great temerity, be denied — although it be not of faith — there follows that conclusion which therefore savors of faith.</w:t>
+      </w:r>
+    </w:p>
+    <w:p>
+      <w:pPr>
+        <w:pStyle w:val="BodyText"/>
+      </w:pPr>
+      <w:r>
+        <w:t xml:space="preserve">An example of the second, thus. In the Host of the altar is Christ, and that Host is to be adored which is elevated by the celebrating Priest. But Christ would not be there, nor would that Host be to be adored, unless it were duly consecrated. Therefore in every Host duly consecrated Christ is, and it is to be adored.</w:t>
+      </w:r>
+    </w:p>
+    <w:p>
+      <w:pPr>
+        <w:pStyle w:val="BodyText"/>
+      </w:pPr>
+      <w:r>
+        <w:t xml:space="preserve">An example of the third, arguing thus. In every Host duly consecrated Christ is, and it is to be adored. Therefore in the Host of the altar Christ is, and it, and that which is elevated by the celebrating Priest, is to be adored. Or conversely, thus. In the Host of the altar, or that which is elevated by the celebrating Priest, is Christ, and it is to be adored; therefore in a Host duly consecrated Christ is, and it is to be adored. Each enthymematic consequence is evident; because it cannot reasonably be denied that the Host of the altar, or that which is elevated by the celebrating Priest, is duly consecrated.</w:t>
+      </w:r>
+    </w:p>
+    <w:p>
+      <w:pPr>
+        <w:pStyle w:val="BodyText"/>
+      </w:pPr>
+      <w:r>
+        <w:t xml:space="preserve">But this proposition, sacramental vocal confession is necessary by divine law, or of faith, and its opposite is heretical, because it was so decreed in Concilio Trid. Sessione. 4. sub Iulio. III. c. 5.; although the most illustrious Medina de confess. q. 4. has said that it merely savors of faith, and that the opposite merely savors of heresy.</w:t>
+      </w:r>
+    </w:p>
+    <w:p>
+      <w:pPr>
+        <w:pStyle w:val="BodyText"/>
+      </w:pPr>
+      <w:r>
+        <w:t xml:space="preserve">Likewise this proposition savors of faith: Blessed Gregory was Pope. For it rightly follows: he was Pope, and only because he was canonically elected; therefore every man canonically elected as Pope is Pope — which is of faith, as Martin V decreed it in the Council of Constance: which follows from that one. Or, on the contrary, arguing thus. Every man canonically elected is Pope; Blessed Gregory was canonically elected; therefore he was Pope. Or thus enthymematically. Blessed Gregory was Pope; therefore every man canonically elected is Pope. Or conversely. Every man canonically elected is Pope; therefore Blessed Gregory was Pope. Both consequences are evident, because he was canonically elected — which cannot reasonably be denied — and no one is Pope for any other reason.</w:t>
+      </w:r>
+    </w:p>
+    <w:p>
+      <w:pPr>
+        <w:pStyle w:val="BodyText"/>
+      </w:pPr>
+      <w:r>
+        <w:t xml:space="preserve">And such a proposition savoring of faith is also, and is called, approaching and pertaining to faith. Thus Gerson. Turecremata, Gabriel, &amp; alij vbi sup. &amp; Medina de confessione. q. 4. Concerning these things let it also be seen, infra. §. 8.</w:t>
+      </w:r>
+    </w:p>
+    <w:p>
+      <w:pPr>
+        <w:pStyle w:val="BodyText"/>
+      </w:pPr>
+      <w:r>
+        <w:rPr>
+          <w:iCs/>
+          <w:i/>
+        </w:rPr>
+        <w:t xml:space="preserve">[§ 2 ends. The next paragraph, not transcribed, opens § 3:]</w:t>
+      </w:r>
+      <w:r>
+        <w:t xml:space="preserve"> </w:t>
+      </w:r>
+      <w:r>
+        <w:t xml:space="preserve">{marg.</w:t>
+      </w:r>
+      <w:r>
+        <w:t xml:space="preserve"> </w:t>
+      </w:r>
+      <w:r>
+        <w:rPr>
+          <w:iCs/>
+          <w:i/>
+        </w:rPr>
+        <w:t xml:space="preserve">§. 3. A proposition of the probability of faith.</w:t>
+      </w:r>
+      <w:r>
+        <w:t xml:space="preserve">} A proposition of the probability of faith is that which, from things defined by the Pope, or by the Church, or by all the sacred Doct[ors], or the scholastics, in matters of faith and morals, follows only probably, or in a consequence |</w:t>
+      </w:r>
+      <w:r>
+        <w:t xml:space="preserve"> </w:t>
+      </w:r>
+      <w:r>
+        <w:rPr>
+          <w:iCs/>
+          <w:i/>
+        </w:rPr>
+        <w:t xml:space="preserve">(catchword</w:t>
+      </w:r>
+      <w:r>
+        <w:t xml:space="preserve"> </w:t>
+      </w:r>
+      <w:r>
+        <w:t xml:space="preserve">tia</w:t>
+      </w:r>
+      <w:r>
+        <w:rPr>
+          <w:iCs/>
+          <w:i/>
+        </w:rPr>
+        <w:t xml:space="preserve">, continued on p. 152)</w:t>
       </w:r>
     </w:p>
     <w:bookmarkEnd w:id="28"/>

</xml_diff>